<commit_message>
docs: give the WhatsApp ban risk its own section in the consent briefing
Expand the ban risk from one bullet into a prominent, plainly-worded
section (WhatsApp's opt-in rule, how a ban triggers, what a ban costs us,
why it's the most likely failure, email/SMS fallbacks). Trim the
now-duplicated concern bullet to point at it. Regenerate md/docx/pdf.

Co-Authored-By: Claude Opus 4.8 <noreply@anthropic.com>
Claude-Session: https://claude.ai/code/session_0168KorWV2c4MiHmP7pRJXmq
</commit_message>
<xml_diff>
--- a/docs/consent-feature-briefing.docx
+++ b/docs/consent-feature-briefing.docx
@@ -304,6 +304,208 @@
           <w:szCs w:val="22"/>
         </w:rPr>
         <w:t xml:space="preserve">→ we do not message them.</w:t>
+      </w:r>
+    </w:p>
+    <w:p>
+      <w:pPr>
+        <w:pStyle w:val="Heading1"/>
+        <w:spacing w:after="110" w:before="260"/>
+      </w:pPr>
+      <w:r>
+        <w:rPr>
+          <w:b/>
+          <w:bCs/>
+          <w:color w:val="1C1B1B"/>
+          <w:sz w:val="26"/>
+          <w:szCs w:val="26"/>
+        </w:rPr>
+        <w:t xml:space="preserve">The biggest risk: WhatsApp may shut us down</w:t>
+      </w:r>
+    </w:p>
+    <w:p>
+      <w:pPr>
+        <w:spacing w:after="120"/>
+      </w:pPr>
+      <w:r>
+        <w:rPr>
+          <w:b/>
+          <w:bCs/>
+          <w:i w:val="false"/>
+          <w:iCs w:val="false"/>
+          <w:color w:val="1C1B1B"/>
+          <w:sz w:val="22"/>
+          <w:szCs w:val="22"/>
+        </w:rPr>
+        <w:t xml:space="preserve">This is the part to weigh most carefully.</w:t>
+      </w:r>
+    </w:p>
+    <w:p>
+      <w:pPr>
+        <w:spacing w:after="120"/>
+      </w:pPr>
+      <w:r>
+        <w:rPr>
+          <w:b w:val="false"/>
+          <w:bCs w:val="false"/>
+          <w:i w:val="false"/>
+          <w:iCs w:val="false"/>
+          <w:color w:val="1C1B1B"/>
+          <w:sz w:val="22"/>
+          <w:szCs w:val="22"/>
+        </w:rPr>
+        <w:t xml:space="preserve">WhatsApp has a strict rule. A business may only message people who agreed to hear from it first. Our plan does the opposite. It messages people who never agreed, just to ask them if they agree. That is the exact thing WhatsApp tries to stop.</w:t>
+      </w:r>
+    </w:p>
+    <w:p>
+      <w:pPr>
+        <w:spacing w:after="120"/>
+      </w:pPr>
+      <w:r>
+        <w:rPr>
+          <w:b w:val="false"/>
+          <w:bCs w:val="false"/>
+          <w:i w:val="false"/>
+          <w:iCs w:val="false"/>
+          <w:color w:val="1C1B1B"/>
+          <w:sz w:val="22"/>
+          <w:szCs w:val="22"/>
+        </w:rPr>
+        <w:t xml:space="preserve">Here is how a ban happens. Many people will get a message from a number they do not know. Some of them will tap Block or Report spam. WhatsApp counts these reports. If enough people report us, WhatsApp lowers our rating, then suspends our number, and can ban it for good.</w:t>
+      </w:r>
+    </w:p>
+    <w:p>
+      <w:pPr>
+        <w:spacing w:after="120"/>
+      </w:pPr>
+      <w:r>
+        <w:rPr>
+          <w:b w:val="false"/>
+          <w:bCs w:val="false"/>
+          <w:i w:val="false"/>
+          <w:iCs w:val="false"/>
+          <w:color w:val="1C1B1B"/>
+          <w:sz w:val="22"/>
+          <w:szCs w:val="22"/>
+        </w:rPr>
+        <w:t xml:space="preserve">If our number is banned:</w:t>
+      </w:r>
+    </w:p>
+    <w:p>
+      <w:pPr>
+        <w:pStyle w:val="ListParagraph"/>
+        <w:numPr>
+          <w:ilvl w:val="0"/>
+          <w:numId w:val="1"/>
+        </w:numPr>
+        <w:spacing w:after="90"/>
+      </w:pPr>
+      <w:r>
+        <w:rPr>
+          <w:b/>
+          <w:bCs/>
+          <w:color w:val="1C1B1B"/>
+          <w:sz w:val="22"/>
+          <w:szCs w:val="22"/>
+        </w:rPr>
+        <w:t xml:space="preserve">The check stops at once. </w:t>
+      </w:r>
+      <w:r>
+        <w:rPr>
+          <w:color w:val="1C1B1B"/>
+          <w:sz w:val="22"/>
+          <w:szCs w:val="22"/>
+        </w:rPr>
+        <w:t xml:space="preserve">No messages go out. The feature simply stops working, often with little warning.</w:t>
+      </w:r>
+    </w:p>
+    <w:p>
+      <w:pPr>
+        <w:pStyle w:val="ListParagraph"/>
+        <w:numPr>
+          <w:ilvl w:val="0"/>
+          <w:numId w:val="1"/>
+        </w:numPr>
+        <w:spacing w:after="90"/>
+      </w:pPr>
+      <w:r>
+        <w:rPr>
+          <w:b/>
+          <w:bCs/>
+          <w:color w:val="1C1B1B"/>
+          <w:sz w:val="22"/>
+          <w:szCs w:val="22"/>
+        </w:rPr>
+        <w:t xml:space="preserve">We lose the number </w:t>
+      </w:r>
+      <w:r>
+        <w:rPr>
+          <w:color w:val="1C1B1B"/>
+          <w:sz w:val="22"/>
+          <w:szCs w:val="22"/>
+        </w:rPr>
+        <w:t xml:space="preserve">we set up and verified.</w:t>
+      </w:r>
+    </w:p>
+    <w:p>
+      <w:pPr>
+        <w:pStyle w:val="ListParagraph"/>
+        <w:numPr>
+          <w:ilvl w:val="0"/>
+          <w:numId w:val="1"/>
+        </w:numPr>
+        <w:spacing w:after="90"/>
+      </w:pPr>
+      <w:r>
+        <w:rPr>
+          <w:b/>
+          <w:bCs/>
+          <w:color w:val="1C1B1B"/>
+          <w:sz w:val="22"/>
+          <w:szCs w:val="22"/>
+        </w:rPr>
+        <w:t xml:space="preserve">Getting it back is slow, and often not possible. </w:t>
+      </w:r>
+      <w:r>
+        <w:rPr>
+          <w:color w:val="1C1B1B"/>
+          <w:sz w:val="22"/>
+          <w:szCs w:val="22"/>
+        </w:rPr>
+        <w:t xml:space="preserve">We would have to start again with a new number and pass WhatsApp's checks all over.</w:t>
+      </w:r>
+    </w:p>
+    <w:p>
+      <w:pPr>
+        <w:spacing w:after="120"/>
+      </w:pPr>
+      <w:r>
+        <w:rPr>
+          <w:b w:val="false"/>
+          <w:bCs w:val="false"/>
+          <w:i w:val="false"/>
+          <w:iCs w:val="false"/>
+          <w:color w:val="1C1B1B"/>
+          <w:sz w:val="22"/>
+          <w:szCs w:val="22"/>
+        </w:rPr>
+        <w:t xml:space="preserve">Be clear on why this matters. This is not a small or rare risk. It is the most likely way this feature breaks, because the feature depends on doing the one thing WhatsApp punishes. The more we use it, the more strangers we message, and the higher the chance of reports and a ban.</w:t>
+      </w:r>
+    </w:p>
+    <w:p>
+      <w:pPr>
+        <w:spacing w:after="120"/>
+      </w:pPr>
+      <w:r>
+        <w:rPr>
+          <w:b w:val="false"/>
+          <w:bCs w:val="false"/>
+          <w:i w:val="false"/>
+          <w:iCs w:val="false"/>
+          <w:color w:val="1C1B1B"/>
+          <w:sz w:val="22"/>
+          <w:szCs w:val="22"/>
+        </w:rPr>
+        <w:t xml:space="preserve">Email and text message (SMS) do not have this problem. If the WhatsApp risk feels too high, we can send the consent request by email only, or by SMS, and keep the same Yes or No check.</w:t>
       </w:r>
     </w:p>
     <w:p>
@@ -940,6 +1142,34 @@
           <w:sz w:val="22"/>
           <w:szCs w:val="22"/>
         </w:rPr>
+        <w:t xml:space="preserve">WhatsApp may ban our number. </w:t>
+      </w:r>
+      <w:r>
+        <w:rPr>
+          <w:color w:val="1C1B1B"/>
+          <w:sz w:val="22"/>
+          <w:szCs w:val="22"/>
+        </w:rPr>
+        <w:t xml:space="preserve">This is the biggest concern. It has its own section above, "The biggest risk".</w:t>
+      </w:r>
+    </w:p>
+    <w:p>
+      <w:pPr>
+        <w:pStyle w:val="ListParagraph"/>
+        <w:numPr>
+          <w:ilvl w:val="0"/>
+          <w:numId w:val="1"/>
+        </w:numPr>
+        <w:spacing w:after="90"/>
+      </w:pPr>
+      <w:r>
+        <w:rPr>
+          <w:b/>
+          <w:bCs/>
+          <w:color w:val="1C1B1B"/>
+          <w:sz w:val="22"/>
+          <w:szCs w:val="22"/>
+        </w:rPr>
         <w:t xml:space="preserve">It can feel like spam. </w:t>
       </w:r>
       <w:r>
@@ -949,34 +1179,6 @@
           <w:szCs w:val="22"/>
         </w:rPr>
         <w:t xml:space="preserve">We message people who did not ask to hear from us.</w:t>
-      </w:r>
-    </w:p>
-    <w:p>
-      <w:pPr>
-        <w:pStyle w:val="ListParagraph"/>
-        <w:numPr>
-          <w:ilvl w:val="0"/>
-          <w:numId w:val="1"/>
-        </w:numPr>
-        <w:spacing w:after="90"/>
-      </w:pPr>
-      <w:r>
-        <w:rPr>
-          <w:b/>
-          <w:bCs/>
-          <w:color w:val="1C1B1B"/>
-          <w:sz w:val="22"/>
-          <w:szCs w:val="22"/>
-        </w:rPr>
-        <w:t xml:space="preserve">WhatsApp can block our number. </w:t>
-      </w:r>
-      <w:r>
-        <w:rPr>
-          <w:color w:val="1C1B1B"/>
-          <w:sz w:val="22"/>
-          <w:szCs w:val="22"/>
-        </w:rPr>
-        <w:t xml:space="preserve">WhatsApp does not like businesses messaging people who never opted in. If it blocks us, this whole check stops working.</w:t>
       </w:r>
     </w:p>
     <w:p>

</xml_diff>